<commit_message>
remove diagrama em texto da arquitetura
</commit_message>
<xml_diff>
--- a/entrega/Documentacao-Raizes-do-Nordeste.docx
+++ b/entrega/Documentacao-Raizes-do-Nordeste.docx
@@ -3001,130 +3001,28 @@
     </w:p>
     <w:p>
       <w:pPr>
-        <w:pStyle w:val="SourceCode"/>
-      </w:pPr>
-      <w:r>
-        <w:rPr>
-          <w:rStyle w:val="VerbatimChar"/>
-        </w:rPr>
-        <w:t xml:space="preserve"> App oficial   Totem   Balcão/PDV   Pick-up</w:t>
-      </w:r>
-      <w:r>
-        <w:br/>
-      </w:r>
-      <w:r>
-        <w:rPr>
-          <w:rStyle w:val="VerbatimChar"/>
-        </w:rPr>
-        <w:t xml:space="preserve">      \          |         |          /</w:t>
-      </w:r>
-      <w:r>
-        <w:br/>
-      </w:r>
-      <w:r>
-        <w:rPr>
-          <w:rStyle w:val="VerbatimChar"/>
-        </w:rPr>
-        <w:t xml:space="preserve">       \         |         |         /</w:t>
-      </w:r>
-      <w:r>
-        <w:br/>
-      </w:r>
-      <w:r>
-        <w:rPr>
-          <w:rStyle w:val="VerbatimChar"/>
-        </w:rPr>
-        <w:t xml:space="preserve">        +----------------------------+</w:t>
-      </w:r>
-      <w:r>
-        <w:br/>
-      </w:r>
-      <w:r>
-        <w:rPr>
-          <w:rStyle w:val="VerbatimChar"/>
-        </w:rPr>
-        <w:t xml:space="preserve">        |      API REST (HTTPS)      |</w:t>
-      </w:r>
-      <w:r>
-        <w:br/>
-      </w:r>
-      <w:r>
-        <w:rPr>
-          <w:rStyle w:val="VerbatimChar"/>
-        </w:rPr>
-        <w:t xml:space="preserve">        |  Spring Boot — camadas:    |</w:t>
-      </w:r>
-      <w:r>
-        <w:br/>
-      </w:r>
-      <w:r>
-        <w:rPr>
-          <w:rStyle w:val="VerbatimChar"/>
-        </w:rPr>
-        <w:t xml:space="preserve">        |  Controller → Service →    |</w:t>
-      </w:r>
-      <w:r>
-        <w:br/>
-      </w:r>
-      <w:r>
-        <w:rPr>
-          <w:rStyle w:val="VerbatimChar"/>
-        </w:rPr>
-        <w:t xml:space="preserve">        |  Repository (JPA)          |</w:t>
-      </w:r>
-      <w:r>
-        <w:br/>
-      </w:r>
-      <w:r>
-        <w:rPr>
-          <w:rStyle w:val="VerbatimChar"/>
-        </w:rPr>
-        <w:t xml:space="preserve">        +----------------------------+</w:t>
-      </w:r>
-      <w:r>
-        <w:br/>
-      </w:r>
-      <w:r>
-        <w:rPr>
-          <w:rStyle w:val="VerbatimChar"/>
-        </w:rPr>
-        <w:t xml:space="preserve">           |            |         \</w:t>
-      </w:r>
-      <w:r>
-        <w:br/>
-      </w:r>
-      <w:r>
-        <w:rPr>
-          <w:rStyle w:val="VerbatimChar"/>
-        </w:rPr>
-        <w:t xml:space="preserve">           |            |          \-&gt; Serviço externo de</w:t>
-      </w:r>
-      <w:r>
-        <w:br/>
-      </w:r>
-      <w:r>
-        <w:rPr>
-          <w:rStyle w:val="VerbatimChar"/>
-        </w:rPr>
-        <w:t xml:space="preserve">        Banco de     Registros         pagamento (seção 5)</w:t>
-      </w:r>
-      <w:r>
-        <w:br/>
-      </w:r>
-      <w:r>
-        <w:rPr>
-          <w:rStyle w:val="VerbatimChar"/>
-        </w:rPr>
-        <w:t xml:space="preserve">        dados        de auditoria</w:t>
-      </w:r>
-      <w:r>
-        <w:br/>
-      </w:r>
-      <w:r>
-        <w:rPr>
-          <w:rStyle w:val="VerbatimChar"/>
-        </w:rPr>
-        <w:t xml:space="preserve">        relacional</w:t>
+        <w:pStyle w:val="BodyText"/>
+      </w:pPr>
+      <w:r>
+        <w:t xml:space="preserve">Os quatro canais (aplicativo, totem, balcão e pick-up) fazem requisições à mesma API,</w:t>
+      </w:r>
+      <w:r>
+        <w:t xml:space="preserve"> </w:t>
+      </w:r>
+      <w:r>
+        <w:t xml:space="preserve">que é organizada em três camadas (Controller, Service e Repository) e usa um banco de</w:t>
+      </w:r>
+      <w:r>
+        <w:t xml:space="preserve"> </w:t>
+      </w:r>
+      <w:r>
+        <w:t xml:space="preserve">dados relacional. A API também se comunica com o serviço externo de pagamento (seção 5)</w:t>
+      </w:r>
+      <w:r>
+        <w:t xml:space="preserve"> </w:t>
+      </w:r>
+      <w:r>
+        <w:t xml:space="preserve">e grava os registros de auditoria no banco.</w:t>
       </w:r>
     </w:p>
     <w:p>

</xml_diff>

<commit_message>
atualiza evidencias com prints da execucao local
</commit_message>
<xml_diff>
--- a/entrega/Documentacao-Raizes-do-Nordeste.docx
+++ b/entrega/Documentacao-Raizes-do-Nordeste.docx
@@ -8062,9 +8062,9 @@
       <w:pPr>
         <w:pStyle w:val="Heading2"/>
       </w:pPr>
-      <w:bookmarkStart w:id="71" w:name="testes-automatizados-mvn-test"/>
-      <w:r>
-        <w:t xml:space="preserve">Testes automatizados (mvn test)</w:t>
+      <w:bookmarkStart w:id="71" w:name="aplicação-em-execução"/>
+      <w:r>
+        <w:t xml:space="preserve">Aplicação em execução</w:t>
       </w:r>
       <w:bookmarkEnd w:id="71"/>
     </w:p>
@@ -8073,7 +8073,40 @@
         <w:pStyle w:val="FirstParagraph"/>
       </w:pPr>
       <w:r>
-        <w:t xml:space="preserve">Execução dos 12 testes automatizados do projeto, todos passando:</w:t>
+        <w:t xml:space="preserve">Terminal com a API iniciada pelo comando</w:t>
+      </w:r>
+      <w:r>
+        <w:t xml:space="preserve"> </w:t>
+      </w:r>
+      <w:r>
+        <w:rPr>
+          <w:rStyle w:val="VerbatimChar"/>
+        </w:rPr>
+        <w:t xml:space="preserve">mvn spring-boot:run</w:t>
+      </w:r>
+      <w:r>
+        <w:t xml:space="preserve"> </w:t>
+      </w:r>
+      <w:r>
+        <w:t xml:space="preserve">(mensagem</w:t>
+      </w:r>
+      <w:r>
+        <w:t xml:space="preserve"> </w:t>
+      </w:r>
+      <w:r>
+        <w:t xml:space="preserve">“</w:t>
+      </w:r>
+      <w:r>
+        <w:t xml:space="preserve">Started RaizesApplication</w:t>
+      </w:r>
+      <w:r>
+        <w:t xml:space="preserve">”</w:t>
+      </w:r>
+      <w:r>
+        <w:t xml:space="preserve"> </w:t>
+      </w:r>
+      <w:r>
+        <w:t xml:space="preserve">e Tomcat na porta 8080):</w:t>
       </w:r>
     </w:p>
     <w:p>
@@ -8083,14 +8116,14 @@
       <w:r>
         <w:drawing>
           <wp:inline>
-            <wp:extent cx="5334000" cy="3680046"/>
+            <wp:extent cx="5334000" cy="753933"/>
             <wp:effectExtent b="0" l="0" r="0" t="0"/>
-            <wp:docPr descr="Resultado do mvn test" title="" id="1" name="Picture"/>
+            <wp:docPr descr="Aplicação em execução" title="" id="1" name="Picture"/>
             <a:graphic>
               <a:graphicData uri="http://schemas.openxmlformats.org/drawingml/2006/picture">
                 <pic:pic>
                   <pic:nvPicPr>
-                    <pic:cNvPr descr="evidencias/testes-mvn.png" id="0" name="Picture"/>
+                    <pic:cNvPr descr="evidencias/execucao-api.png" id="0" name="Picture"/>
                     <pic:cNvPicPr>
                       <a:picLocks noChangeArrowheads="1" noChangeAspect="1"/>
                     </pic:cNvPicPr>
@@ -8104,7 +8137,7 @@
                   <pic:spPr bwMode="auto">
                     <a:xfrm>
                       <a:off x="0" y="0"/>
-                      <a:ext cx="5334000" cy="3680046"/>
+                      <a:ext cx="5334000" cy="753933"/>
                     </a:xfrm>
                     <a:prstGeom prst="rect">
                       <a:avLst/>
@@ -8128,7 +8161,7 @@
         <w:pStyle w:val="ImageCaption"/>
       </w:pPr>
       <w:r>
-        <w:t xml:space="preserve">Resultado do mvn test</w:t>
+        <w:t xml:space="preserve">Aplicação em execução</w:t>
       </w:r>
     </w:p>
     <w:p>
@@ -8146,16 +8179,7 @@
         <w:pStyle w:val="FirstParagraph"/>
       </w:pPr>
       <w:r>
-        <w:t xml:space="preserve">API em execução local (</w:t>
-      </w:r>
-      <w:r>
-        <w:rPr>
-          <w:rStyle w:val="VerbatimChar"/>
-        </w:rPr>
-        <w:t xml:space="preserve">mvn spring-boot:run</w:t>
-      </w:r>
-      <w:r>
-        <w:t xml:space="preserve">), com a documentação interativa disponível em</w:t>
+        <w:t xml:space="preserve">Com a API rodando, a documentação interativa fica disponível em</w:t>
       </w:r>
       <w:r>
         <w:t xml:space="preserve"> </w:t>
@@ -8177,7 +8201,7 @@
       <w:r>
         <w:drawing>
           <wp:inline>
-            <wp:extent cx="5334000" cy="4000500"/>
+            <wp:extent cx="5334000" cy="2882011"/>
             <wp:effectExtent b="0" l="0" r="0" t="0"/>
             <wp:docPr descr="Swagger UI" title="" id="1" name="Picture"/>
             <a:graphic>
@@ -8198,7 +8222,7 @@
                   <pic:spPr bwMode="auto">
                     <a:xfrm>
                       <a:off x="0" y="0"/>
-                      <a:ext cx="5334000" cy="4000500"/>
+                      <a:ext cx="5334000" cy="2882011"/>
                     </a:xfrm>
                     <a:prstGeom prst="rect">
                       <a:avLst/>
@@ -8265,7 +8289,7 @@
       <w:r>
         <w:drawing>
           <wp:inline>
-            <wp:extent cx="5334000" cy="4000500"/>
+            <wp:extent cx="5334000" cy="2751865"/>
             <wp:effectExtent b="0" l="0" r="0" t="0"/>
             <wp:docPr descr="Cardápio da unidade 1" title="" id="1" name="Picture"/>
             <a:graphic>
@@ -8286,7 +8310,7 @@
                   <pic:spPr bwMode="auto">
                     <a:xfrm>
                       <a:off x="0" y="0"/>
-                      <a:ext cx="5334000" cy="4000500"/>
+                      <a:ext cx="5334000" cy="2751865"/>
                     </a:xfrm>
                     <a:prstGeom prst="rect">
                       <a:avLst/>

</xml_diff>

<commit_message>
capa com logo da universidade
</commit_message>
<xml_diff>
--- a/entrega/Documentacao-Raizes-do-Nordeste.docx
+++ b/entrega/Documentacao-Raizes-do-Nordeste.docx
@@ -208,57 +208,6 @@
       </w:r>
       <w:r>
         <w:t xml:space="preserve">4904087</w:t>
-      </w:r>
-    </w:p>
-    <w:p>
-      <w:pPr>
-        <w:pStyle w:val="BodyText"/>
-      </w:pPr>
-      <w:r>
-        <w:rPr>
-          <w:b/>
-        </w:rPr>
-        <w:t xml:space="preserve">Polo de apoio:</w:t>
-      </w:r>
-      <w:r>
-        <w:t xml:space="preserve"> </w:t>
-      </w:r>
-      <w:r>
-        <w:t xml:space="preserve">[PREENCHER]</w:t>
-      </w:r>
-    </w:p>
-    <w:p>
-      <w:pPr>
-        <w:pStyle w:val="BodyText"/>
-      </w:pPr>
-      <w:r>
-        <w:rPr>
-          <w:b/>
-        </w:rPr>
-        <w:t xml:space="preserve">Semestre:</w:t>
-      </w:r>
-      <w:r>
-        <w:t xml:space="preserve"> </w:t>
-      </w:r>
-      <w:r>
-        <w:t xml:space="preserve">[PREENCHER]</w:t>
-      </w:r>
-    </w:p>
-    <w:p>
-      <w:pPr>
-        <w:pStyle w:val="BodyText"/>
-      </w:pPr>
-      <w:r>
-        <w:rPr>
-          <w:b/>
-        </w:rPr>
-        <w:t xml:space="preserve">Professor:</w:t>
-      </w:r>
-      <w:r>
-        <w:t xml:space="preserve"> </w:t>
-      </w:r>
-      <w:r>
-        <w:t xml:space="preserve">[PREENCHER]</w:t>
       </w:r>
     </w:p>
     <w:p>

</xml_diff>

<commit_message>
capa de pagina inteira com logo
</commit_message>
<xml_diff>
--- a/entrega/Documentacao-Raizes-do-Nordeste.docx
+++ b/entrega/Documentacao-Raizes-do-Nordeste.docx
@@ -2,120 +2,6 @@
 <file path=word/document.xml><?xml version="1.0" encoding="utf-8"?>
 <w:document xmlns:w="http://schemas.openxmlformats.org/wordprocessingml/2006/main" xmlns:m="http://schemas.openxmlformats.org/officeDocument/2006/math" xmlns:r="http://schemas.openxmlformats.org/officeDocument/2006/relationships" xmlns:o="urn:schemas-microsoft-com:office:office" xmlns:v="urn:schemas-microsoft-com:vml" xmlns:w10="urn:schemas-microsoft-com:office:word" xmlns:a="http://schemas.openxmlformats.org/drawingml/2006/main" xmlns:pic="http://schemas.openxmlformats.org/drawingml/2006/picture" xmlns:wp="http://schemas.openxmlformats.org/drawingml/2006/wordprocessingDrawing">
   <w:body>
-    <w:p>
-      <w:pPr>
-        <w:pStyle w:val="Title"/>
-      </w:pPr>
-      <w:r>
-        <w:t xml:space="preserve">Rede</w:t>
-      </w:r>
-      <w:r>
-        <w:t xml:space="preserve"> </w:t>
-      </w:r>
-      <w:r>
-        <w:t xml:space="preserve">“</w:t>
-      </w:r>
-      <w:r>
-        <w:t xml:space="preserve">Raízes</w:t>
-      </w:r>
-      <w:r>
-        <w:t xml:space="preserve"> </w:t>
-      </w:r>
-      <w:r>
-        <w:t xml:space="preserve">do</w:t>
-      </w:r>
-      <w:r>
-        <w:t xml:space="preserve"> </w:t>
-      </w:r>
-      <w:r>
-        <w:t xml:space="preserve">Nordeste</w:t>
-      </w:r>
-      <w:r>
-        <w:t xml:space="preserve">”</w:t>
-      </w:r>
-      <w:r>
-        <w:t xml:space="preserve"> </w:t>
-      </w:r>
-      <w:r>
-        <w:t xml:space="preserve">—</w:t>
-      </w:r>
-      <w:r>
-        <w:t xml:space="preserve"> </w:t>
-      </w:r>
-      <w:r>
-        <w:t xml:space="preserve">Sistema</w:t>
-      </w:r>
-      <w:r>
-        <w:t xml:space="preserve"> </w:t>
-      </w:r>
-      <w:r>
-        <w:t xml:space="preserve">de</w:t>
-      </w:r>
-      <w:r>
-        <w:t xml:space="preserve"> </w:t>
-      </w:r>
-      <w:r>
-        <w:t xml:space="preserve">Pedidos</w:t>
-      </w:r>
-      <w:r>
-        <w:t xml:space="preserve"> </w:t>
-      </w:r>
-      <w:r>
-        <w:t xml:space="preserve">Multicanal</w:t>
-      </w:r>
-    </w:p>
-    <w:p>
-      <w:pPr>
-        <w:pStyle w:val="Subtitle"/>
-      </w:pPr>
-      <w:r>
-        <w:t xml:space="preserve">Projeto</w:t>
-      </w:r>
-      <w:r>
-        <w:t xml:space="preserve"> </w:t>
-      </w:r>
-      <w:r>
-        <w:t xml:space="preserve">Multidisciplinar</w:t>
-      </w:r>
-      <w:r>
-        <w:t xml:space="preserve"> </w:t>
-      </w:r>
-      <w:r>
-        <w:t xml:space="preserve">—</w:t>
-      </w:r>
-      <w:r>
-        <w:t xml:space="preserve"> </w:t>
-      </w:r>
-      <w:r>
-        <w:t xml:space="preserve">Trilha</w:t>
-      </w:r>
-      <w:r>
-        <w:t xml:space="preserve"> </w:t>
-      </w:r>
-      <w:r>
-        <w:t xml:space="preserve">Back-end</w:t>
-      </w:r>
-    </w:p>
-    <w:p>
-      <w:pPr>
-        <w:pStyle w:val="Author"/>
-      </w:pPr>
-      <w:r>
-        <w:t xml:space="preserve">Ramon</w:t>
-      </w:r>
-      <w:r>
-        <w:t xml:space="preserve"> </w:t>
-      </w:r>
-      <w:r>
-        <w:t xml:space="preserve">De</w:t>
-      </w:r>
-      <w:r>
-        <w:t xml:space="preserve"> </w:t>
-      </w:r>
-      <w:r>
-        <w:t xml:space="preserve">Oliveira</w:t>
-      </w:r>
-    </w:p>
     <w:sdt>
       <w:sdtPr>
         <w:docPartObj>
@@ -142,74 +28,6 @@
         </w:p>
       </w:sdtContent>
     </w:sdt>
-    <w:p>
-      <w:pPr>
-        <w:pStyle w:val="FirstParagraph"/>
-      </w:pPr>
-      <w:r>
-        <w:rPr>
-          <w:b/>
-        </w:rPr>
-        <w:t xml:space="preserve">Curso:</w:t>
-      </w:r>
-      <w:r>
-        <w:t xml:space="preserve"> </w:t>
-      </w:r>
-      <w:r>
-        <w:t xml:space="preserve">CST em Análise e Desenvolvimento de Sistemas</w:t>
-      </w:r>
-    </w:p>
-    <w:p>
-      <w:pPr>
-        <w:pStyle w:val="BodyText"/>
-      </w:pPr>
-      <w:r>
-        <w:rPr>
-          <w:b/>
-        </w:rPr>
-        <w:t xml:space="preserve">Disciplina:</w:t>
-      </w:r>
-      <w:r>
-        <w:t xml:space="preserve"> </w:t>
-      </w:r>
-      <w:r>
-        <w:t xml:space="preserve">Projeto Multidisciplinar</w:t>
-      </w:r>
-    </w:p>
-    <w:p>
-      <w:pPr>
-        <w:pStyle w:val="BodyText"/>
-      </w:pPr>
-      <w:r>
-        <w:rPr>
-          <w:b/>
-        </w:rPr>
-        <w:t xml:space="preserve">Aluno:</w:t>
-      </w:r>
-      <w:r>
-        <w:t xml:space="preserve"> </w:t>
-      </w:r>
-      <w:r>
-        <w:t xml:space="preserve">Ramon De Oliveira</w:t>
-      </w:r>
-    </w:p>
-    <w:p>
-      <w:pPr>
-        <w:pStyle w:val="BodyText"/>
-      </w:pPr>
-      <w:r>
-        <w:rPr>
-          <w:b/>
-        </w:rPr>
-        <w:t xml:space="preserve">RU:</w:t>
-      </w:r>
-      <w:r>
-        <w:t xml:space="preserve"> </w:t>
-      </w:r>
-      <w:r>
-        <w:t xml:space="preserve">4904087</w:t>
-      </w:r>
-    </w:p>
     <w:p>
       <w:pPr>
         <w:pStyle w:val="Heading1"/>

</xml_diff>

<commit_message>
adiciona declaracao de uso de IA
</commit_message>
<xml_diff>
--- a/entrega/Documentacao-Raizes-do-Nordeste.docx
+++ b/entrega/Documentacao-Raizes-do-Nordeste.docx
@@ -8102,6 +8102,290 @@
       </w:pPr>
       <w:r>
         <w:t xml:space="preserve">Cardápio da unidade 1</w:t>
+      </w:r>
+    </w:p>
+    <w:p>
+      <w:pPr>
+        <w:pStyle w:val="Heading1"/>
+      </w:pPr>
+      <w:bookmarkStart w:id="77" w:name="X6e5363a2ea64c40705be1be4ad3b57716cacb0d"/>
+      <w:r>
+        <w:t xml:space="preserve">Declaração de Uso de Inteligência Artificial</w:t>
+      </w:r>
+      <w:bookmarkEnd w:id="77"/>
+    </w:p>
+    <w:p>
+      <w:pPr>
+        <w:pStyle w:val="FirstParagraph"/>
+      </w:pPr>
+      <w:r>
+        <w:t xml:space="preserve">Em atendimento às regras da atividade, declaro que utilizei ferramenta de</w:t>
+      </w:r>
+      <w:r>
+        <w:t xml:space="preserve"> </w:t>
+      </w:r>
+      <w:r>
+        <w:t xml:space="preserve">Inteligência Artificial na elaboração deste trabalho.</w:t>
+      </w:r>
+    </w:p>
+    <w:p>
+      <w:pPr>
+        <w:pStyle w:val="BodyText"/>
+      </w:pPr>
+      <w:r>
+        <w:rPr>
+          <w:b/>
+        </w:rPr>
+        <w:t xml:space="preserve">Ferramenta utilizada:</w:t>
+      </w:r>
+      <w:r>
+        <w:t xml:space="preserve"> </w:t>
+      </w:r>
+      <w:r>
+        <w:t xml:space="preserve">Devin (agente de IA da Cognition AI).</w:t>
+      </w:r>
+    </w:p>
+    <w:p>
+      <w:pPr>
+        <w:pStyle w:val="BodyText"/>
+      </w:pPr>
+      <w:r>
+        <w:rPr>
+          <w:b/>
+        </w:rPr>
+        <w:t xml:space="preserve">Como a ferramenta foi utilizada:</w:t>
+      </w:r>
+      <w:r>
+        <w:t xml:space="preserve"> </w:t>
+      </w:r>
+      <w:r>
+        <w:t xml:space="preserve">a partir do estudo de caso oficial da</w:t>
+      </w:r>
+      <w:r>
+        <w:t xml:space="preserve"> </w:t>
+      </w:r>
+      <w:r>
+        <w:t xml:space="preserve">disciplina, solicitei à ferramenta apoio nas seguintes etapas:</w:t>
+      </w:r>
+    </w:p>
+    <w:p>
+      <w:pPr>
+        <w:numPr>
+          <w:ilvl w:val="0"/>
+          <w:numId w:val="1018"/>
+        </w:numPr>
+        <w:pStyle w:val="Compact"/>
+      </w:pPr>
+      <w:r>
+        <w:t xml:space="preserve">levantamento e organização dos requisitos funcionais e não funcionais a partir</w:t>
+      </w:r>
+      <w:r>
+        <w:t xml:space="preserve"> </w:t>
+      </w:r>
+      <w:r>
+        <w:t xml:space="preserve">do estudo de caso;</w:t>
+      </w:r>
+    </w:p>
+    <w:p>
+      <w:pPr>
+        <w:numPr>
+          <w:ilvl w:val="0"/>
+          <w:numId w:val="1018"/>
+        </w:numPr>
+        <w:pStyle w:val="Compact"/>
+      </w:pPr>
+      <w:r>
+        <w:t xml:space="preserve">elaboração dos diagramas (casos de uso, classes e DER);</w:t>
+      </w:r>
+    </w:p>
+    <w:p>
+      <w:pPr>
+        <w:numPr>
+          <w:ilvl w:val="0"/>
+          <w:numId w:val="1018"/>
+        </w:numPr>
+        <w:pStyle w:val="Compact"/>
+      </w:pPr>
+      <w:r>
+        <w:t xml:space="preserve">desenvolvimento do código do back-end em Java com Spring Boot e dos testes</w:t>
+      </w:r>
+      <w:r>
+        <w:t xml:space="preserve"> </w:t>
+      </w:r>
+      <w:r>
+        <w:t xml:space="preserve">automatizados;</w:t>
+      </w:r>
+    </w:p>
+    <w:p>
+      <w:pPr>
+        <w:numPr>
+          <w:ilvl w:val="0"/>
+          <w:numId w:val="1018"/>
+        </w:numPr>
+        <w:pStyle w:val="Compact"/>
+      </w:pPr>
+      <w:r>
+        <w:t xml:space="preserve">redação e organização deste documento (introdução, arquitetura, documentação</w:t>
+      </w:r>
+      <w:r>
+        <w:t xml:space="preserve"> </w:t>
+      </w:r>
+      <w:r>
+        <w:t xml:space="preserve">da API, plano de testes, conclusão e referências);</w:t>
+      </w:r>
+    </w:p>
+    <w:p>
+      <w:pPr>
+        <w:numPr>
+          <w:ilvl w:val="0"/>
+          <w:numId w:val="1018"/>
+        </w:numPr>
+        <w:pStyle w:val="Compact"/>
+      </w:pPr>
+      <w:r>
+        <w:t xml:space="preserve">geração do PDF e organização do repositório no GitHub.</w:t>
+      </w:r>
+    </w:p>
+    <w:p>
+      <w:pPr>
+        <w:pStyle w:val="FirstParagraph"/>
+      </w:pPr>
+      <w:r>
+        <w:rPr>
+          <w:b/>
+        </w:rPr>
+        <w:t xml:space="preserve">Exemplos de prompts utilizados:</w:t>
+      </w:r>
+    </w:p>
+    <w:p>
+      <w:pPr>
+        <w:numPr>
+          <w:ilvl w:val="0"/>
+          <w:numId w:val="1019"/>
+        </w:numPr>
+        <w:pStyle w:val="Compact"/>
+      </w:pPr>
+      <w:r>
+        <w:t xml:space="preserve">“</w:t>
+      </w:r>
+      <w:r>
+        <w:t xml:space="preserve">Todo o desenvolvimento deverá ser baseado exclusivamente nas informações</w:t>
+      </w:r>
+      <w:r>
+        <w:t xml:space="preserve"> </w:t>
+      </w:r>
+      <w:r>
+        <w:t xml:space="preserve">presentes no estudo de caso</w:t>
+      </w:r>
+      <w:r>
+        <w:t xml:space="preserve">”</w:t>
+      </w:r>
+      <w:r>
+        <w:t xml:space="preserve">;</w:t>
+      </w:r>
+    </w:p>
+    <w:p>
+      <w:pPr>
+        <w:numPr>
+          <w:ilvl w:val="0"/>
+          <w:numId w:val="1019"/>
+        </w:numPr>
+        <w:pStyle w:val="Compact"/>
+      </w:pPr>
+      <w:r>
+        <w:t xml:space="preserve">“</w:t>
+      </w:r>
+      <w:r>
+        <w:t xml:space="preserve">Deixe o código do projeto mais simples, mais nível iniciante</w:t>
+      </w:r>
+      <w:r>
+        <w:t xml:space="preserve">”</w:t>
+      </w:r>
+      <w:r>
+        <w:t xml:space="preserve">;</w:t>
+      </w:r>
+    </w:p>
+    <w:p>
+      <w:pPr>
+        <w:numPr>
+          <w:ilvl w:val="0"/>
+          <w:numId w:val="1019"/>
+        </w:numPr>
+        <w:pStyle w:val="Compact"/>
+      </w:pPr>
+      <w:r>
+        <w:t xml:space="preserve">“</w:t>
+      </w:r>
+      <w:r>
+        <w:t xml:space="preserve">Faça o sumário mais simples, com os capítulos principais</w:t>
+      </w:r>
+      <w:r>
+        <w:t xml:space="preserve">”</w:t>
+      </w:r>
+      <w:r>
+        <w:t xml:space="preserve">;</w:t>
+      </w:r>
+    </w:p>
+    <w:p>
+      <w:pPr>
+        <w:numPr>
+          <w:ilvl w:val="0"/>
+          <w:numId w:val="1019"/>
+        </w:numPr>
+        <w:pStyle w:val="Compact"/>
+      </w:pPr>
+      <w:r>
+        <w:t xml:space="preserve">“</w:t>
+      </w:r>
+      <w:r>
+        <w:t xml:space="preserve">Adicione prints reais da execução (Swagger e resultado do mvn test) como</w:t>
+      </w:r>
+      <w:r>
+        <w:t xml:space="preserve"> </w:t>
+      </w:r>
+      <w:r>
+        <w:t xml:space="preserve">evidência no documento</w:t>
+      </w:r>
+      <w:r>
+        <w:t xml:space="preserve">”</w:t>
+      </w:r>
+      <w:r>
+        <w:t xml:space="preserve">.</w:t>
+      </w:r>
+    </w:p>
+    <w:p>
+      <w:pPr>
+        <w:pStyle w:val="FirstParagraph"/>
+      </w:pPr>
+      <w:r>
+        <w:rPr>
+          <w:b/>
+        </w:rPr>
+        <w:t xml:space="preserve">Trechos aproveitados:</w:t>
+      </w:r>
+      <w:r>
+        <w:t xml:space="preserve"> </w:t>
+      </w:r>
+      <w:r>
+        <w:t xml:space="preserve">o código-fonte do back-end, os testes automatizados,</w:t>
+      </w:r>
+      <w:r>
+        <w:t xml:space="preserve"> </w:t>
+      </w:r>
+      <w:r>
+        <w:t xml:space="preserve">os diagramas e o texto deste documento foram produzidos com apoio da ferramenta,</w:t>
+      </w:r>
+      <w:r>
+        <w:t xml:space="preserve"> </w:t>
+      </w:r>
+      <w:r>
+        <w:t xml:space="preserve">sob minha orientação e revisão. As capturas de tela dos anexos foram feitas por</w:t>
+      </w:r>
+      <w:r>
+        <w:t xml:space="preserve"> </w:t>
+      </w:r>
+      <w:r>
+        <w:t xml:space="preserve">mim, executando a aplicação e os testes no meu computador.</w:t>
       </w:r>
     </w:p>
     <w:sectPr/>
@@ -8531,6 +8815,12 @@
     <w:abstractNumId w:val="991"/>
   </w:num>
   <w:num w:numId="1017">
+    <w:abstractNumId w:val="991"/>
+  </w:num>
+  <w:num w:numId="1018">
+    <w:abstractNumId w:val="991"/>
+  </w:num>
+  <w:num w:numId="1019">
     <w:abstractNumId w:val="991"/>
   </w:num>
 </w:numbering>

</xml_diff>

<commit_message>
word com capa e sumario
</commit_message>
<xml_diff>
--- a/entrega/Documentacao-Raizes-do-Nordeste.docx
+++ b/entrega/Documentacao-Raizes-do-Nordeste.docx
@@ -2,51 +2,248 @@
 <file path=word/document.xml><?xml version="1.0" encoding="utf-8"?>
 <w:document xmlns:w="http://schemas.openxmlformats.org/wordprocessingml/2006/main" xmlns:m="http://schemas.openxmlformats.org/officeDocument/2006/math" xmlns:r="http://schemas.openxmlformats.org/officeDocument/2006/relationships" xmlns:o="urn:schemas-microsoft-com:office:office" xmlns:v="urn:schemas-microsoft-com:vml" xmlns:w10="urn:schemas-microsoft-com:office:word" xmlns:a="http://schemas.openxmlformats.org/drawingml/2006/main" xmlns:pic="http://schemas.openxmlformats.org/drawingml/2006/picture" xmlns:wp="http://schemas.openxmlformats.org/drawingml/2006/wordprocessingDrawing">
   <w:body>
-    <w:sdt>
-      <w:sdtPr>
-        <w:docPartObj>
-          <w:docPartGallery w:val="Table of Contents"/>
-          <w:docPartUnique/>
-        </w:docPartObj>
-      </w:sdtPr>
-      <w:sdtContent>
-        <w:p>
-          <w:pPr>
-            <w:pStyle w:val="TOCHeading"/>
-          </w:pPr>
-          <w:r>
-            <w:t xml:space="preserve">Table of Contents</w:t>
-          </w:r>
-        </w:p>
-        <w:p>
-          <w:r>
-            <w:fldChar w:fldCharType="begin" w:dirty="true"/>
-            <w:instrText xml:space="preserve">TOC \o "1-1" \h \z \u</w:instrText>
-            <w:fldChar w:fldCharType="separate"/>
-            <w:fldChar w:fldCharType="end"/>
-          </w:r>
-        </w:p>
-      </w:sdtContent>
-    </w:sdt>
+    <w:p>
+      <w:pPr>
+        <w:pStyle w:val="Title"/>
+      </w:pPr>
+      <w:r>
+        <w:drawing>
+          <wp:inline>
+            <wp:extent cx="3239999" cy="775195"/>
+            <wp:effectExtent b="0" l="0" r="0" t="0"/>
+            <wp:docPr descr="" title="" id="1" name="Picture"/>
+            <a:graphic>
+              <a:graphicData uri="http://schemas.openxmlformats.org/drawingml/2006/picture">
+                <pic:pic>
+                  <pic:nvPicPr>
+                    <pic:cNvPr descr="logo-uninter.jpg" id="0" name="Picture"/>
+                    <pic:cNvPicPr>
+                      <a:picLocks noChangeArrowheads="1" noChangeAspect="1"/>
+                    </pic:cNvPicPr>
+                  </pic:nvPicPr>
+                  <pic:blipFill>
+                    <a:blip r:embed="rId20"/>
+                    <a:stretch>
+                      <a:fillRect/>
+                    </a:stretch>
+                  </pic:blipFill>
+                  <pic:spPr bwMode="auto">
+                    <a:xfrm>
+                      <a:off x="0" y="0"/>
+                      <a:ext cx="3239999" cy="775195"/>
+                    </a:xfrm>
+                    <a:prstGeom prst="rect">
+                      <a:avLst/>
+                    </a:prstGeom>
+                    <a:noFill/>
+                    <a:ln w="9525">
+                      <a:noFill/>
+                      <a:headEnd/>
+                      <a:tailEnd/>
+                    </a:ln>
+                  </pic:spPr>
+                </pic:pic>
+              </a:graphicData>
+            </a:graphic>
+          </wp:inline>
+        </w:drawing>
+      </w:r>
+    </w:p>
+    <w:p>
+      <w:pPr>
+        <w:pStyle w:val="BodyText"/>
+      </w:pPr>
+      <w:r>
+        <w:t xml:space="preserve"> </w:t>
+      </w:r>
+    </w:p>
+    <w:p>
+      <w:pPr>
+        <w:pStyle w:val="Title"/>
+      </w:pPr>
+      <w:r>
+        <w:t xml:space="preserve">Rede</w:t>
+      </w:r>
+      <w:r>
+        <w:t xml:space="preserve"> </w:t>
+      </w:r>
+      <w:r>
+        <w:t xml:space="preserve">“</w:t>
+      </w:r>
+      <w:r>
+        <w:t xml:space="preserve">Raízes do Nordeste</w:t>
+      </w:r>
+      <w:r>
+        <w:t xml:space="preserve">”</w:t>
+      </w:r>
+    </w:p>
+    <w:p>
+      <w:pPr>
+        <w:pStyle w:val="Subtitle"/>
+      </w:pPr>
+      <w:r>
+        <w:t xml:space="preserve">Sistema de Pedidos Multicanal</w:t>
+      </w:r>
+    </w:p>
+    <w:p>
+      <w:pPr>
+        <w:pStyle w:val="Subtitle"/>
+      </w:pPr>
+      <w:r>
+        <w:t xml:space="preserve">Projeto Multidisciplinar — Trilha Back-end</w:t>
+      </w:r>
+    </w:p>
+    <w:p>
+      <w:pPr>
+        <w:pStyle w:val="BodyText"/>
+      </w:pPr>
+      <w:r>
+        <w:t xml:space="preserve"> </w:t>
+      </w:r>
+    </w:p>
+    <w:p>
+      <w:pPr>
+        <w:pStyle w:val="BodyText"/>
+      </w:pPr>
+      <w:r>
+        <w:t xml:space="preserve"> </w:t>
+      </w:r>
+    </w:p>
+    <w:p>
+      <w:pPr>
+        <w:pStyle w:val="BodyText"/>
+      </w:pPr>
+      <w:r>
+        <w:rPr>
+          <w:b/>
+        </w:rPr>
+        <w:t xml:space="preserve">Curso:</w:t>
+      </w:r>
+      <w:r>
+        <w:t xml:space="preserve"> </w:t>
+      </w:r>
+      <w:r>
+        <w:t xml:space="preserve">CST em Análise e Desenvolvimento de Sistemas</w:t>
+      </w:r>
+    </w:p>
+    <w:p>
+      <w:pPr>
+        <w:pStyle w:val="BodyText"/>
+      </w:pPr>
+      <w:r>
+        <w:rPr>
+          <w:b/>
+        </w:rPr>
+        <w:t xml:space="preserve">Disciplina:</w:t>
+      </w:r>
+      <w:r>
+        <w:t xml:space="preserve"> </w:t>
+      </w:r>
+      <w:r>
+        <w:t xml:space="preserve">Projeto Multidisciplinar</w:t>
+      </w:r>
+    </w:p>
+    <w:p>
+      <w:pPr>
+        <w:pStyle w:val="BodyText"/>
+      </w:pPr>
+      <w:r>
+        <w:rPr>
+          <w:b/>
+        </w:rPr>
+        <w:t xml:space="preserve">Aluno:</w:t>
+      </w:r>
+      <w:r>
+        <w:t xml:space="preserve"> </w:t>
+      </w:r>
+      <w:r>
+        <w:t xml:space="preserve">Ramon De Oliveira</w:t>
+      </w:r>
+    </w:p>
+    <w:p>
+      <w:pPr>
+        <w:pStyle w:val="BodyText"/>
+      </w:pPr>
+      <w:r>
+        <w:rPr>
+          <w:b/>
+        </w:rPr>
+        <w:t xml:space="preserve">RU:</w:t>
+      </w:r>
+      <w:r>
+        <w:t xml:space="preserve"> </w:t>
+      </w:r>
+      <w:r>
+        <w:t xml:space="preserve">4904087</w:t>
+      </w:r>
+    </w:p>
+    <w:p>
+      <w:pPr>
+        <w:pStyle w:val="BodyText"/>
+      </w:pPr>
+      <w:r>
+        <w:t xml:space="preserve"> </w:t>
+      </w:r>
+    </w:p>
+    <w:p>
+      <w:pPr>
+        <w:pStyle w:val="BodyText"/>
+      </w:pPr>
+      <w:r>
+        <w:rPr>
+          <w:b/>
+        </w:rPr>
+        <w:t xml:space="preserve">2026</w:t>
+      </w:r>
+    </w:p>
+    <w:p>
+      <w:r>
+        <w:br w:type="page"/>
+      </w:r>
+    </w:p>
     <w:p>
       <w:pPr>
         <w:pStyle w:val="Heading1"/>
       </w:pPr>
-      <w:bookmarkStart w:id="20" w:name="introdução"/>
+      <w:bookmarkStart w:id="21" w:name="sumário"/>
+      <w:r>
+        <w:t xml:space="preserve">Sumário</w:t>
+      </w:r>
+      <w:bookmarkEnd w:id="21"/>
+    </w:p>
+    <w:p>
+      <w:r>
+        <w:fldChar w:fldCharType="begin" w:dirty="true"/>
+        <w:instrText xml:space="preserve"> TOC \o "1-1" \h \z \u </w:instrText>
+        <w:fldChar w:fldCharType="separate"/>
+        <w:t>(Clique aqui com o botão direito e escolha "Atualizar campo" para preencher o sumário.)</w:t>
+        <w:fldChar w:fldCharType="end"/>
+      </w:r>
+    </w:p>
+    <w:p>
+      <w:r>
+        <w:br w:type="page"/>
+      </w:r>
+    </w:p>
+    <w:p>
+      <w:pPr>
+        <w:pStyle w:val="Heading1"/>
+      </w:pPr>
+      <w:bookmarkStart w:id="22" w:name="introdução"/>
       <w:r>
         <w:t xml:space="preserve">1. Introdução</w:t>
       </w:r>
-      <w:bookmarkEnd w:id="20"/>
+      <w:bookmarkEnd w:id="22"/>
     </w:p>
     <w:p>
       <w:pPr>
         <w:pStyle w:val="Heading2"/>
       </w:pPr>
-      <w:bookmarkStart w:id="21" w:name="contexto"/>
+      <w:bookmarkStart w:id="23" w:name="contexto"/>
       <w:r>
         <w:t xml:space="preserve">Contexto</w:t>
       </w:r>
-      <w:bookmarkEnd w:id="21"/>
+      <w:bookmarkEnd w:id="23"/>
     </w:p>
     <w:p>
       <w:pPr>
@@ -84,11 +281,11 @@
       <w:pPr>
         <w:pStyle w:val="Heading2"/>
       </w:pPr>
-      <w:bookmarkStart w:id="22" w:name="objetivos-do-projeto"/>
+      <w:bookmarkStart w:id="24" w:name="objetivos-do-projeto"/>
       <w:r>
         <w:t xml:space="preserve">Objetivos do projeto</w:t>
       </w:r>
-      <w:bookmarkEnd w:id="22"/>
+      <w:bookmarkEnd w:id="24"/>
     </w:p>
     <w:p>
       <w:pPr>
@@ -166,11 +363,11 @@
       <w:pPr>
         <w:pStyle w:val="Heading2"/>
       </w:pPr>
-      <w:bookmarkStart w:id="23" w:name="principais-usuários"/>
+      <w:bookmarkStart w:id="25" w:name="principais-usuários"/>
       <w:r>
         <w:t xml:space="preserve">Principais usuários</w:t>
       </w:r>
-      <w:bookmarkEnd w:id="23"/>
+      <w:bookmarkEnd w:id="25"/>
     </w:p>
     <w:p>
       <w:pPr>
@@ -281,11 +478,11 @@
       <w:pPr>
         <w:pStyle w:val="Heading2"/>
       </w:pPr>
-      <w:bookmarkStart w:id="24" w:name="relevância-do-sistema"/>
+      <w:bookmarkStart w:id="26" w:name="relevância-do-sistema"/>
       <w:r>
         <w:t xml:space="preserve">Relevância do sistema</w:t>
       </w:r>
-      <w:bookmarkEnd w:id="24"/>
+      <w:bookmarkEnd w:id="26"/>
     </w:p>
     <w:p>
       <w:pPr>
@@ -311,11 +508,11 @@
       <w:pPr>
         <w:pStyle w:val="Heading1"/>
       </w:pPr>
-      <w:bookmarkStart w:id="25" w:name="análise-e-requisitos"/>
+      <w:bookmarkStart w:id="27" w:name="análise-e-requisitos"/>
       <w:r>
         <w:t xml:space="preserve">2. Análise e Requisitos</w:t>
       </w:r>
-      <w:bookmarkEnd w:id="25"/>
+      <w:bookmarkEnd w:id="27"/>
     </w:p>
     <w:p>
       <w:pPr>
@@ -341,11 +538,11 @@
       <w:pPr>
         <w:pStyle w:val="Heading2"/>
       </w:pPr>
-      <w:bookmarkStart w:id="26" w:name="etapa-1-leitura"/>
+      <w:bookmarkStart w:id="28" w:name="etapa-1-leitura"/>
       <w:r>
         <w:t xml:space="preserve">Etapa 1 — Leitura</w:t>
       </w:r>
-      <w:bookmarkEnd w:id="26"/>
+      <w:bookmarkEnd w:id="28"/>
     </w:p>
     <w:p>
       <w:pPr>
@@ -463,21 +660,21 @@
       <w:pPr>
         <w:pStyle w:val="Heading2"/>
       </w:pPr>
-      <w:bookmarkStart w:id="27" w:name="etapa-2-requisitos-explícitos"/>
+      <w:bookmarkStart w:id="29" w:name="etapa-2-requisitos-explícitos"/>
       <w:r>
         <w:t xml:space="preserve">Etapa 2 — Requisitos explícitos</w:t>
       </w:r>
-      <w:bookmarkEnd w:id="27"/>
+      <w:bookmarkEnd w:id="29"/>
     </w:p>
     <w:p>
       <w:pPr>
         <w:pStyle w:val="Heading3"/>
       </w:pPr>
-      <w:bookmarkStart w:id="28" w:name="requisitos-funcionais-rf"/>
+      <w:bookmarkStart w:id="30" w:name="requisitos-funcionais-rf"/>
       <w:r>
         <w:t xml:space="preserve">Requisitos Funcionais (RF)</w:t>
       </w:r>
-      <w:bookmarkEnd w:id="28"/>
+      <w:bookmarkEnd w:id="30"/>
     </w:p>
     <w:tbl>
       <w:tblPr>
@@ -1476,11 +1673,11 @@
       <w:pPr>
         <w:pStyle w:val="Heading3"/>
       </w:pPr>
-      <w:bookmarkStart w:id="29" w:name="requisitos-não-funcionais-rnf"/>
+      <w:bookmarkStart w:id="31" w:name="requisitos-não-funcionais-rnf"/>
       <w:r>
         <w:t xml:space="preserve">Requisitos Não Funcionais (RNF)</w:t>
       </w:r>
-      <w:bookmarkEnd w:id="29"/>
+      <w:bookmarkEnd w:id="31"/>
     </w:p>
     <w:tbl>
       <w:tblPr>
@@ -1869,11 +2066,11 @@
       <w:pPr>
         <w:pStyle w:val="Heading2"/>
       </w:pPr>
-      <w:bookmarkStart w:id="30" w:name="etapa-3-inferências-mínimas-justificadas"/>
+      <w:bookmarkStart w:id="32" w:name="etapa-3-inferências-mínimas-justificadas"/>
       <w:r>
         <w:t xml:space="preserve">Etapa 3 — Inferências mínimas (justificadas)</w:t>
       </w:r>
-      <w:bookmarkEnd w:id="30"/>
+      <w:bookmarkEnd w:id="32"/>
     </w:p>
     <w:p>
       <w:pPr>
@@ -2385,11 +2582,11 @@
       <w:pPr>
         <w:pStyle w:val="Heading2"/>
       </w:pPr>
-      <w:bookmarkStart w:id="31" w:name="etapa-4-validação"/>
+      <w:bookmarkStart w:id="33" w:name="etapa-4-validação"/>
       <w:r>
         <w:t xml:space="preserve">Etapa 4 — Validação</w:t>
       </w:r>
-      <w:bookmarkEnd w:id="31"/>
+      <w:bookmarkEnd w:id="33"/>
     </w:p>
     <w:p>
       <w:pPr>
@@ -2504,21 +2701,21 @@
       <w:pPr>
         <w:pStyle w:val="Heading1"/>
       </w:pPr>
-      <w:bookmarkStart w:id="32" w:name="modelagem-e-arquitetura"/>
+      <w:bookmarkStart w:id="34" w:name="modelagem-e-arquitetura"/>
       <w:r>
         <w:t xml:space="preserve">3. Modelagem e Arquitetura</w:t>
       </w:r>
-      <w:bookmarkEnd w:id="32"/>
+      <w:bookmarkEnd w:id="34"/>
     </w:p>
     <w:p>
       <w:pPr>
         <w:pStyle w:val="Heading2"/>
       </w:pPr>
-      <w:bookmarkStart w:id="33" w:name="diagrama-de-casos-de-uso"/>
+      <w:bookmarkStart w:id="35" w:name="diagrama-de-casos-de-uso"/>
       <w:r>
         <w:t xml:space="preserve">Diagrama de Casos de Uso</w:t>
       </w:r>
-      <w:bookmarkEnd w:id="33"/>
+      <w:bookmarkEnd w:id="35"/>
     </w:p>
     <w:p>
       <w:pPr>
@@ -2540,7 +2737,7 @@
                     </pic:cNvPicPr>
                   </pic:nvPicPr>
                   <pic:blipFill>
-                    <a:blip r:embed="rId34"/>
+                    <a:blip r:embed="rId36"/>
                     <a:stretch>
                       <a:fillRect/>
                     </a:stretch>
@@ -2579,11 +2776,11 @@
       <w:pPr>
         <w:pStyle w:val="Heading2"/>
       </w:pPr>
-      <w:bookmarkStart w:id="35" w:name="diagrama-de-classes"/>
+      <w:bookmarkStart w:id="37" w:name="diagrama-de-classes"/>
       <w:r>
         <w:t xml:space="preserve">Diagrama de Classes</w:t>
       </w:r>
-      <w:bookmarkEnd w:id="35"/>
+      <w:bookmarkEnd w:id="37"/>
     </w:p>
     <w:p>
       <w:pPr>
@@ -2605,7 +2802,7 @@
                     </pic:cNvPicPr>
                   </pic:nvPicPr>
                   <pic:blipFill>
-                    <a:blip r:embed="rId36"/>
+                    <a:blip r:embed="rId38"/>
                     <a:stretch>
                       <a:fillRect/>
                     </a:stretch>
@@ -2644,11 +2841,11 @@
       <w:pPr>
         <w:pStyle w:val="Heading2"/>
       </w:pPr>
-      <w:bookmarkStart w:id="37" w:name="der"/>
+      <w:bookmarkStart w:id="39" w:name="der"/>
       <w:r>
         <w:t xml:space="preserve">DER</w:t>
       </w:r>
-      <w:bookmarkEnd w:id="37"/>
+      <w:bookmarkEnd w:id="39"/>
     </w:p>
     <w:p>
       <w:pPr>
@@ -2670,7 +2867,7 @@
                     </pic:cNvPicPr>
                   </pic:nvPicPr>
                   <pic:blipFill>
-                    <a:blip r:embed="rId38"/>
+                    <a:blip r:embed="rId40"/>
                     <a:stretch>
                       <a:fillRect/>
                     </a:stretch>
@@ -2709,21 +2906,21 @@
       <w:pPr>
         <w:pStyle w:val="Heading2"/>
       </w:pPr>
-      <w:bookmarkStart w:id="39" w:name="arquitetura-proposta"/>
+      <w:bookmarkStart w:id="41" w:name="arquitetura-proposta"/>
       <w:r>
         <w:t xml:space="preserve">Arquitetura Proposta</w:t>
       </w:r>
-      <w:bookmarkEnd w:id="39"/>
+      <w:bookmarkEnd w:id="41"/>
     </w:p>
     <w:p>
       <w:pPr>
         <w:pStyle w:val="Heading3"/>
       </w:pPr>
-      <w:bookmarkStart w:id="40" w:name="visão-geral"/>
+      <w:bookmarkStart w:id="42" w:name="visão-geral"/>
       <w:r>
         <w:t xml:space="preserve">Visão geral</w:t>
       </w:r>
-      <w:bookmarkEnd w:id="40"/>
+      <w:bookmarkEnd w:id="42"/>
     </w:p>
     <w:p>
       <w:pPr>
@@ -2796,11 +2993,11 @@
       <w:pPr>
         <w:pStyle w:val="Heading3"/>
       </w:pPr>
-      <w:bookmarkStart w:id="41" w:name="decisões-e-justificativas"/>
+      <w:bookmarkStart w:id="43" w:name="decisões-e-justificativas"/>
       <w:r>
         <w:t xml:space="preserve">Decisões e justificativas</w:t>
       </w:r>
-      <w:bookmarkEnd w:id="41"/>
+      <w:bookmarkEnd w:id="43"/>
     </w:p>
     <w:tbl>
       <w:tblPr>
@@ -3057,11 +3254,11 @@
       <w:pPr>
         <w:pStyle w:val="Heading3"/>
       </w:pPr>
-      <w:bookmarkStart w:id="42" w:name="X2ea6265ec29c8ded823149f01565da6648a991d"/>
+      <w:bookmarkStart w:id="44" w:name="X2ea6265ec29c8ded823149f01565da6648a991d"/>
       <w:r>
         <w:t xml:space="preserve">Alta disponibilidade, escalabilidade e tolerância a falhas (seção 6)</w:t>
       </w:r>
-      <w:bookmarkEnd w:id="42"/>
+      <w:bookmarkEnd w:id="44"/>
     </w:p>
     <w:p>
       <w:pPr>
@@ -3178,11 +3375,11 @@
       <w:pPr>
         <w:pStyle w:val="Heading3"/>
       </w:pPr>
-      <w:bookmarkStart w:id="43" w:name="lgpd-seção-4"/>
+      <w:bookmarkStart w:id="45" w:name="lgpd-seção-4"/>
       <w:r>
         <w:t xml:space="preserve">LGPD (seção 4)</w:t>
       </w:r>
-      <w:bookmarkEnd w:id="43"/>
+      <w:bookmarkEnd w:id="45"/>
     </w:p>
     <w:p>
       <w:pPr>
@@ -3260,11 +3457,11 @@
       <w:pPr>
         <w:pStyle w:val="Heading3"/>
       </w:pPr>
-      <w:bookmarkStart w:id="44" w:name="evolução-futura"/>
+      <w:bookmarkStart w:id="46" w:name="evolução-futura"/>
       <w:r>
         <w:t xml:space="preserve">Evolução futura</w:t>
       </w:r>
-      <w:bookmarkEnd w:id="44"/>
+      <w:bookmarkEnd w:id="46"/>
     </w:p>
     <w:p>
       <w:pPr>
@@ -3290,11 +3487,11 @@
       <w:pPr>
         <w:pStyle w:val="Heading2"/>
       </w:pPr>
-      <w:bookmarkStart w:id="45" w:name="documentação-da-api-principais-endpoints"/>
+      <w:bookmarkStart w:id="47" w:name="documentação-da-api-principais-endpoints"/>
       <w:r>
         <w:t xml:space="preserve">Documentação da API (principais endpoints)</w:t>
       </w:r>
-      <w:bookmarkEnd w:id="45"/>
+      <w:bookmarkEnd w:id="47"/>
     </w:p>
     <w:p>
       <w:pPr>
@@ -3379,11 +3576,11 @@
       <w:pPr>
         <w:pStyle w:val="Heading3"/>
       </w:pPr>
-      <w:bookmarkStart w:id="46" w:name="unidades-e-cardápio-rf01-rf05-rf19"/>
+      <w:bookmarkStart w:id="48" w:name="unidades-e-cardápio-rf01-rf05-rf19"/>
       <w:r>
         <w:t xml:space="preserve">Unidades e cardápio (RF01, RF05, RF19)</w:t>
       </w:r>
-      <w:bookmarkEnd w:id="46"/>
+      <w:bookmarkEnd w:id="48"/>
     </w:p>
     <w:tbl>
       <w:tblPr>
@@ -3609,11 +3806,11 @@
       <w:pPr>
         <w:pStyle w:val="Heading3"/>
       </w:pPr>
-      <w:bookmarkStart w:id="47" w:name="pedidos-rf02-rf03-rf04-rf07-rf12"/>
+      <w:bookmarkStart w:id="49" w:name="pedidos-rf02-rf03-rf04-rf07-rf12"/>
       <w:r>
         <w:t xml:space="preserve">Pedidos (RF02, RF03, RF04, RF07, RF12)</w:t>
       </w:r>
-      <w:bookmarkEnd w:id="47"/>
+      <w:bookmarkEnd w:id="49"/>
     </w:p>
     <w:tbl>
       <w:tblPr>
@@ -4278,11 +4475,11 @@
       <w:pPr>
         <w:pStyle w:val="Heading3"/>
       </w:pPr>
-      <w:bookmarkStart w:id="48" w:name="pagamentos-rf17-rf18"/>
+      <w:bookmarkStart w:id="50" w:name="pagamentos-rf17-rf18"/>
       <w:r>
         <w:t xml:space="preserve">Pagamentos (RF17, RF18)</w:t>
       </w:r>
-      <w:bookmarkEnd w:id="48"/>
+      <w:bookmarkEnd w:id="50"/>
     </w:p>
     <w:tbl>
       <w:tblPr>
@@ -4545,11 +4742,11 @@
       <w:pPr>
         <w:pStyle w:val="Heading3"/>
       </w:pPr>
-      <w:bookmarkStart w:id="49" w:name="clientes-fidelidade-e-lgpd-rf11rf16"/>
+      <w:bookmarkStart w:id="51" w:name="clientes-fidelidade-e-lgpd-rf11rf16"/>
       <w:r>
         <w:t xml:space="preserve">Clientes, fidelidade e LGPD (RF11–RF16)</w:t>
       </w:r>
-      <w:bookmarkEnd w:id="49"/>
+      <w:bookmarkEnd w:id="51"/>
     </w:p>
     <w:tbl>
       <w:tblPr>
@@ -4869,11 +5066,11 @@
       <w:pPr>
         <w:pStyle w:val="Heading3"/>
       </w:pPr>
-      <w:bookmarkStart w:id="50" w:name="estoque-rf06-rf07"/>
+      <w:bookmarkStart w:id="52" w:name="estoque-rf06-rf07"/>
       <w:r>
         <w:t xml:space="preserve">Estoque (RF06, RF07)</w:t>
       </w:r>
-      <w:bookmarkEnd w:id="50"/>
+      <w:bookmarkEnd w:id="52"/>
     </w:p>
     <w:tbl>
       <w:tblPr>
@@ -5023,11 +5220,11 @@
       <w:pPr>
         <w:pStyle w:val="Heading3"/>
       </w:pPr>
-      <w:bookmarkStart w:id="51" w:name="relatórios-da-matriz-rf08-rf09-rf10-rf20"/>
+      <w:bookmarkStart w:id="53" w:name="relatórios-da-matriz-rf08-rf09-rf10-rf20"/>
       <w:r>
         <w:t xml:space="preserve">Relatórios da matriz (RF08, RF09, RF10, RF20)</w:t>
       </w:r>
-      <w:bookmarkEnd w:id="51"/>
+      <w:bookmarkEnd w:id="53"/>
     </w:p>
     <w:tbl>
       <w:tblPr>
@@ -5253,11 +5450,11 @@
       <w:pPr>
         <w:pStyle w:val="Heading3"/>
       </w:pPr>
-      <w:bookmarkStart w:id="52" w:name="auditoria-rf07-rf16"/>
+      <w:bookmarkStart w:id="54" w:name="auditoria-rf07-rf16"/>
       <w:r>
         <w:t xml:space="preserve">Auditoria (RF07, RF16)</w:t>
       </w:r>
-      <w:bookmarkEnd w:id="52"/>
+      <w:bookmarkEnd w:id="54"/>
     </w:p>
     <w:tbl>
       <w:tblPr>
@@ -5426,11 +5623,11 @@
       <w:pPr>
         <w:pStyle w:val="Heading3"/>
       </w:pPr>
-      <w:bookmarkStart w:id="53" w:name="erros"/>
+      <w:bookmarkStart w:id="55" w:name="erros"/>
       <w:r>
         <w:t xml:space="preserve">Erros</w:t>
       </w:r>
-      <w:bookmarkEnd w:id="53"/>
+      <w:bookmarkEnd w:id="55"/>
     </w:p>
     <w:tbl>
       <w:tblPr>
@@ -5558,21 +5755,21 @@
       <w:pPr>
         <w:pStyle w:val="Heading1"/>
       </w:pPr>
-      <w:bookmarkStart w:id="54" w:name="entrega-técnica"/>
+      <w:bookmarkStart w:id="56" w:name="entrega-técnica"/>
       <w:r>
         <w:t xml:space="preserve">4. Entrega Técnica</w:t>
       </w:r>
-      <w:bookmarkEnd w:id="54"/>
+      <w:bookmarkEnd w:id="56"/>
     </w:p>
     <w:p>
       <w:pPr>
         <w:pStyle w:val="Heading2"/>
       </w:pPr>
-      <w:bookmarkStart w:id="55" w:name="repositório"/>
+      <w:bookmarkStart w:id="57" w:name="repositório"/>
       <w:r>
         <w:t xml:space="preserve">Repositório</w:t>
       </w:r>
-      <w:bookmarkEnd w:id="55"/>
+      <w:bookmarkEnd w:id="57"/>
     </w:p>
     <w:p>
       <w:pPr>
@@ -5597,11 +5794,11 @@
       <w:pPr>
         <w:pStyle w:val="Heading2"/>
       </w:pPr>
-      <w:bookmarkStart w:id="56" w:name="artefatos-entregues"/>
+      <w:bookmarkStart w:id="58" w:name="artefatos-entregues"/>
       <w:r>
         <w:t xml:space="preserve">Artefatos entregues</w:t>
       </w:r>
-      <w:bookmarkEnd w:id="56"/>
+      <w:bookmarkEnd w:id="58"/>
     </w:p>
     <w:p>
       <w:pPr>
@@ -5775,11 +5972,11 @@
       <w:pPr>
         <w:pStyle w:val="Heading2"/>
       </w:pPr>
-      <w:bookmarkStart w:id="57" w:name="como-executar-a-demonstração"/>
+      <w:bookmarkStart w:id="59" w:name="como-executar-a-demonstração"/>
       <w:r>
         <w:t xml:space="preserve">Como executar a demonstração</w:t>
       </w:r>
-      <w:bookmarkEnd w:id="57"/>
+      <w:bookmarkEnd w:id="59"/>
     </w:p>
     <w:p>
       <w:pPr>
@@ -5884,11 +6081,11 @@
       <w:pPr>
         <w:pStyle w:val="Heading2"/>
       </w:pPr>
-      <w:bookmarkStart w:id="58" w:name="evidências"/>
+      <w:bookmarkStart w:id="60" w:name="evidências"/>
       <w:r>
         <w:t xml:space="preserve">Evidências</w:t>
       </w:r>
-      <w:bookmarkEnd w:id="58"/>
+      <w:bookmarkEnd w:id="60"/>
     </w:p>
     <w:p>
       <w:pPr>
@@ -5957,21 +6154,21 @@
       <w:pPr>
         <w:pStyle w:val="Heading1"/>
       </w:pPr>
-      <w:bookmarkStart w:id="59" w:name="plano-de-testes-e-evidências"/>
+      <w:bookmarkStart w:id="61" w:name="plano-de-testes-e-evidências"/>
       <w:r>
         <w:t xml:space="preserve">5. Plano de Testes e Evidências</w:t>
       </w:r>
-      <w:bookmarkEnd w:id="59"/>
+      <w:bookmarkEnd w:id="61"/>
     </w:p>
     <w:p>
       <w:pPr>
         <w:pStyle w:val="Heading2"/>
       </w:pPr>
-      <w:bookmarkStart w:id="60" w:name="objetivo"/>
+      <w:bookmarkStart w:id="62" w:name="objetivo"/>
       <w:r>
         <w:t xml:space="preserve">Objetivo</w:t>
       </w:r>
-      <w:bookmarkEnd w:id="60"/>
+      <w:bookmarkEnd w:id="62"/>
     </w:p>
     <w:p>
       <w:pPr>
@@ -5997,11 +6194,11 @@
       <w:pPr>
         <w:pStyle w:val="Heading2"/>
       </w:pPr>
-      <w:bookmarkStart w:id="61" w:name="estratégia"/>
+      <w:bookmarkStart w:id="63" w:name="estratégia"/>
       <w:r>
         <w:t xml:space="preserve">Estratégia</w:t>
       </w:r>
-      <w:bookmarkEnd w:id="61"/>
+      <w:bookmarkEnd w:id="63"/>
     </w:p>
     <w:tbl>
       <w:tblPr>
@@ -6189,11 +6386,11 @@
       <w:pPr>
         <w:pStyle w:val="Heading2"/>
       </w:pPr>
-      <w:bookmarkStart w:id="62" w:name="casos-de-teste"/>
+      <w:bookmarkStart w:id="64" w:name="casos-de-teste"/>
       <w:r>
         <w:t xml:space="preserve">Casos de teste</w:t>
       </w:r>
-      <w:bookmarkEnd w:id="62"/>
+      <w:bookmarkEnd w:id="64"/>
     </w:p>
     <w:tbl>
       <w:tblPr>
@@ -7150,11 +7347,11 @@
       <w:pPr>
         <w:pStyle w:val="Heading2"/>
       </w:pPr>
-      <w:bookmarkStart w:id="63" w:name="Xdfac226d23eb619eb2485703fbb730fcd97c953"/>
+      <w:bookmarkStart w:id="65" w:name="Xdfac226d23eb619eb2485703fbb730fcd97c953"/>
       <w:r>
         <w:t xml:space="preserve">Exemplos detalhados (entrada, passos e saída esperada)</w:t>
       </w:r>
-      <w:bookmarkEnd w:id="63"/>
+      <w:bookmarkEnd w:id="65"/>
     </w:p>
     <w:p>
       <w:pPr>
@@ -7409,11 +7606,11 @@
       <w:pPr>
         <w:pStyle w:val="Heading2"/>
       </w:pPr>
-      <w:bookmarkStart w:id="64" w:name="critérios-de-aceite"/>
+      <w:bookmarkStart w:id="66" w:name="critérios-de-aceite"/>
       <w:r>
         <w:t xml:space="preserve">Critérios de aceite</w:t>
       </w:r>
-      <w:bookmarkEnd w:id="64"/>
+      <w:bookmarkEnd w:id="66"/>
     </w:p>
     <w:p>
       <w:pPr>
@@ -7470,11 +7667,11 @@
       <w:pPr>
         <w:pStyle w:val="Heading1"/>
       </w:pPr>
-      <w:bookmarkStart w:id="65" w:name="conclusão"/>
+      <w:bookmarkStart w:id="67" w:name="conclusão"/>
       <w:r>
         <w:t xml:space="preserve">6. Conclusão</w:t>
       </w:r>
-      <w:bookmarkEnd w:id="65"/>
+      <w:bookmarkEnd w:id="67"/>
     </w:p>
     <w:p>
       <w:pPr>
@@ -7506,11 +7703,11 @@
       <w:pPr>
         <w:pStyle w:val="Heading2"/>
       </w:pPr>
-      <w:bookmarkStart w:id="66" w:name="principais-lições-aprendidas"/>
+      <w:bookmarkStart w:id="68" w:name="principais-lições-aprendidas"/>
       <w:r>
         <w:t xml:space="preserve">Principais lições aprendidas</w:t>
       </w:r>
-      <w:bookmarkEnd w:id="66"/>
+      <w:bookmarkEnd w:id="68"/>
     </w:p>
     <w:p>
       <w:pPr>
@@ -7582,11 +7779,11 @@
       <w:pPr>
         <w:pStyle w:val="Heading2"/>
       </w:pPr>
-      <w:bookmarkStart w:id="67" w:name="desafios"/>
+      <w:bookmarkStart w:id="69" w:name="desafios"/>
       <w:r>
         <w:t xml:space="preserve">Desafios</w:t>
       </w:r>
-      <w:bookmarkEnd w:id="67"/>
+      <w:bookmarkEnd w:id="69"/>
     </w:p>
     <w:p>
       <w:pPr>
@@ -7628,11 +7825,11 @@
       <w:pPr>
         <w:pStyle w:val="Heading2"/>
       </w:pPr>
-      <w:bookmarkStart w:id="68" w:name="pontos-de-atenção-para-evoluções-futuras"/>
+      <w:bookmarkStart w:id="70" w:name="pontos-de-atenção-para-evoluções-futuras"/>
       <w:r>
         <w:t xml:space="preserve">Pontos de atenção para evoluções futuras</w:t>
       </w:r>
-      <w:bookmarkEnd w:id="68"/>
+      <w:bookmarkEnd w:id="70"/>
     </w:p>
     <w:p>
       <w:pPr>
@@ -7686,11 +7883,11 @@
       <w:pPr>
         <w:pStyle w:val="Heading1"/>
       </w:pPr>
-      <w:bookmarkStart w:id="69" w:name="referências"/>
+      <w:bookmarkStart w:id="71" w:name="referências"/>
       <w:r>
         <w:t xml:space="preserve">7. Referências</w:t>
       </w:r>
-      <w:bookmarkEnd w:id="69"/>
+      <w:bookmarkEnd w:id="71"/>
     </w:p>
     <w:p>
       <w:pPr>
@@ -7819,21 +8016,21 @@
       <w:pPr>
         <w:pStyle w:val="Heading1"/>
       </w:pPr>
-      <w:bookmarkStart w:id="70" w:name="anexos-evidências-de-execução"/>
+      <w:bookmarkStart w:id="72" w:name="anexos-evidências-de-execução"/>
       <w:r>
         <w:t xml:space="preserve">Anexos — Evidências de Execução</w:t>
       </w:r>
-      <w:bookmarkEnd w:id="70"/>
+      <w:bookmarkEnd w:id="72"/>
     </w:p>
     <w:p>
       <w:pPr>
         <w:pStyle w:val="Heading2"/>
       </w:pPr>
-      <w:bookmarkStart w:id="71" w:name="aplicação-em-execução"/>
+      <w:bookmarkStart w:id="73" w:name="aplicação-em-execução"/>
       <w:r>
         <w:t xml:space="preserve">Aplicação em execução</w:t>
       </w:r>
-      <w:bookmarkEnd w:id="71"/>
+      <w:bookmarkEnd w:id="73"/>
     </w:p>
     <w:p>
       <w:pPr>
@@ -7896,7 +8093,7 @@
                     </pic:cNvPicPr>
                   </pic:nvPicPr>
                   <pic:blipFill>
-                    <a:blip r:embed="rId72"/>
+                    <a:blip r:embed="rId74"/>
                     <a:stretch>
                       <a:fillRect/>
                     </a:stretch>
@@ -7935,11 +8132,11 @@
       <w:pPr>
         <w:pStyle w:val="Heading2"/>
       </w:pPr>
-      <w:bookmarkStart w:id="73" w:name="swagger-ui"/>
+      <w:bookmarkStart w:id="75" w:name="swagger-ui"/>
       <w:r>
         <w:t xml:space="preserve">Swagger UI</w:t>
       </w:r>
-      <w:bookmarkEnd w:id="73"/>
+      <w:bookmarkEnd w:id="75"/>
     </w:p>
     <w:p>
       <w:pPr>
@@ -7981,7 +8178,7 @@
                     </pic:cNvPicPr>
                   </pic:nvPicPr>
                   <pic:blipFill>
-                    <a:blip r:embed="rId74"/>
+                    <a:blip r:embed="rId76"/>
                     <a:stretch>
                       <a:fillRect/>
                     </a:stretch>
@@ -8020,11 +8217,11 @@
       <w:pPr>
         <w:pStyle w:val="Heading2"/>
       </w:pPr>
-      <w:bookmarkStart w:id="75" w:name="exemplo-de-requisição"/>
+      <w:bookmarkStart w:id="77" w:name="exemplo-de-requisição"/>
       <w:r>
         <w:t xml:space="preserve">Exemplo de requisição</w:t>
       </w:r>
-      <w:bookmarkEnd w:id="75"/>
+      <w:bookmarkEnd w:id="77"/>
     </w:p>
     <w:p>
       <w:pPr>
@@ -8069,7 +8266,7 @@
                     </pic:cNvPicPr>
                   </pic:nvPicPr>
                   <pic:blipFill>
-                    <a:blip r:embed="rId76"/>
+                    <a:blip r:embed="rId78"/>
                     <a:stretch>
                       <a:fillRect/>
                     </a:stretch>

</xml_diff>